<commit_message>
added base SQL for the db
</commit_message>
<xml_diff>
--- a/Group69/40480980 - Conall/40480980_Design_Spec.docx
+++ b/Group69/40480980 - Conall/40480980_Design_Spec.docx
@@ -170,88 +170,36 @@
       </w:r>
     </w:p>
     <w:p>
-      <w:pPr>
-        <w:rPr>
-          <w:sz w:val="22"/>
-          <w:szCs w:val="22"/>
-        </w:rPr>
-      </w:pPr>
-      <w:r>
-        <w:rPr>
-          <w:sz w:val="22"/>
-          <w:szCs w:val="22"/>
-        </w:rPr>
+      <w:r>
         <w:t xml:space="preserve">My proposed system will </w:t>
       </w:r>
       <w:r>
-        <w:rPr>
-          <w:sz w:val="22"/>
-          <w:szCs w:val="22"/>
-        </w:rPr>
         <w:t xml:space="preserve">register job seekers, recording enrolment in support programmes, </w:t>
       </w:r>
       <w:r>
-        <w:rPr>
-          <w:sz w:val="22"/>
-          <w:szCs w:val="22"/>
-        </w:rPr>
         <w:t>track placements and employment data and monitor wage and sector data.</w:t>
       </w:r>
       <w:r>
-        <w:rPr>
-          <w:sz w:val="22"/>
-          <w:szCs w:val="22"/>
-        </w:rPr>
         <w:t xml:space="preserve"> It collects this data in order to provide informed </w:t>
       </w:r>
       <w:r>
-        <w:rPr>
-          <w:sz w:val="22"/>
-          <w:szCs w:val="22"/>
-        </w:rPr>
         <w:t xml:space="preserve">reports and analytics. </w:t>
       </w:r>
     </w:p>
     <w:p>
-      <w:pPr>
-        <w:rPr>
-          <w:sz w:val="22"/>
-          <w:szCs w:val="22"/>
-        </w:rPr>
-      </w:pPr>
-      <w:r>
-        <w:rPr>
-          <w:sz w:val="22"/>
-          <w:szCs w:val="22"/>
-        </w:rPr>
+      <w:r>
         <w:t xml:space="preserve">Key stakeholders in this system would be people such as </w:t>
       </w:r>
       <w:r>
-        <w:rPr>
-          <w:sz w:val="22"/>
-          <w:szCs w:val="22"/>
-        </w:rPr>
         <w:t xml:space="preserve">employment advisors who can </w:t>
       </w:r>
       <w:r>
-        <w:rPr>
-          <w:sz w:val="22"/>
-          <w:szCs w:val="22"/>
-        </w:rPr>
         <w:t xml:space="preserve">create participant records, update employment status and review participant history. </w:t>
       </w:r>
       <w:r>
-        <w:rPr>
-          <w:sz w:val="22"/>
-          <w:szCs w:val="22"/>
-        </w:rPr>
         <w:t>Policy analysts will also be a stakeholder being able to</w:t>
       </w:r>
       <w:r>
-        <w:rPr>
-          <w:sz w:val="22"/>
-          <w:szCs w:val="22"/>
-        </w:rPr>
         <w:t xml:space="preserve"> analyse trends, examine demographic inequalities and determine the effectiveness of programmes.</w:t>
       </w:r>
     </w:p>

</xml_diff>